<commit_message>
feat: regenerate bulletted-standard resumes, skill gap, and interview prep packages for BSI, Symetra, CU Boulder, and Maximus with Agentic AI for Finance additions
</commit_message>
<xml_diff>
--- a/output/BSI_AI_Technical_Specialist/Ebenezer_Rolston_BSI_AI_Technical_Specialist_Interview_Prep.docx
+++ b/output/BSI_AI_Technical_Specialist/Ebenezer_Rolston_BSI_AI_Technical_Specialist_Interview_Prep.docx
@@ -255,6 +255,36 @@
           <w:color w:val="28323C"/>
           <w:sz w:val="19"/>
         </w:rPr>
+        <w:t>Evaluating Agentic AI Systems:</w:t>
+      </w:r>
+      <w:r>
+        <w:rPr>
+          <w:rFonts w:ascii="Calibri" w:hAnsi="Calibri"/>
+          <w:color w:val="28323C"/>
+          <w:sz w:val="19"/>
+        </w:rPr>
+        <w:t xml:space="preserve"> Increasingly, BSI will assess autonomous agent-based systems where the harness architecture, loop governance, termination conditions, and execution sandboxing are as critical as the underlying model performance.</w:t>
+      </w:r>
+    </w:p>
+    <w:p>
+      <w:pPr>
+        <w:pStyle w:val="ListBullet"/>
+        <w:spacing w:before="0" w:after="40"/>
+      </w:pPr>
+      <w:r>
+        <w:rPr>
+          <w:rFonts w:ascii="Calibri" w:hAnsi="Calibri"/>
+          <w:color w:val="28323C"/>
+          <w:sz w:val="19"/>
+        </w:rPr>
+      </w:r>
+      <w:r>
+        <w:rPr>
+          <w:rFonts w:ascii="Calibri" w:hAnsi="Calibri"/>
+          <w:b/>
+          <w:color w:val="28323C"/>
+          <w:sz w:val="19"/>
+        </w:rPr>
         <w:t>Client Technical Engagement &amp; Advisory:</w:t>
       </w:r>
       <w:r>
@@ -321,7 +351,7 @@
           <w:color w:val="28323C"/>
           <w:sz w:val="19"/>
         </w:rPr>
-        <w:t xml:space="preserve"> Review BSI’s accredited conformity assessment workflows, technical documentation review checklists, and CE-marking reporting templates.</w:t>
+        <w:t xml:space="preserve"> Review BSI's accredited conformity assessment workflows, technical documentation review checklists, and CE-marking reporting templates.</w:t>
       </w:r>
     </w:p>
     <w:p>
@@ -403,7 +433,7 @@
           <w:color w:val="28323C"/>
           <w:sz w:val="19"/>
         </w:rPr>
-        <w:t>Audit Tooling Setup:</w:t>
+        <w:t>Introduce Harness Engineering Evaluation Framework:</w:t>
       </w:r>
       <w:r>
         <w:rPr>
@@ -411,7 +441,7 @@
           <w:color w:val="28323C"/>
           <w:sz w:val="19"/>
         </w:rPr>
-        <w:t xml:space="preserve"> Familiarize with BSI internal platforms, documentation repositories, and collaborative assessment tracking tools.</w:t>
+        <w:t xml:space="preserve"> Present the 4-layer harness architecture model (Identity/Behavior, Runtime, Feedback Loop, Governance/Security) and the 6-dimension evaluation scorecard (Correctness, Grounding, Latency p95, Cost, Safety, Auditability) as a candidate assessment methodology for agentic AI submissions.</w:t>
       </w:r>
     </w:p>
     <w:p>
@@ -455,7 +485,7 @@
           <w:color w:val="28323C"/>
           <w:sz w:val="19"/>
         </w:rPr>
-        <w:t xml:space="preserve"> Under mentor supervision, independently review manufacturers' technical files, verifying algorithmic choices, validation metrics (ROC-AUC, F1, calibration curves), and test data segregation.</w:t>
+        <w:t xml:space="preserve"> Under mentor supervision, independently review manufacturers' technical files, verifying algorithmic choices, validation metrics (ROC-AUC, F1, calibration curves), test data segregation, and now — structured output safety (3-tier validation) and agent termination condition compliance.</w:t>
       </w:r>
     </w:p>
     <w:p>
@@ -485,7 +515,7 @@
           <w:color w:val="28323C"/>
           <w:sz w:val="19"/>
         </w:rPr>
-        <w:t xml:space="preserve"> Attend technical discovery sessions with manufacturers, formulating targeted questions regarding data preprocessing, validation splits, and model drift mitigation.</w:t>
+        <w:t xml:space="preserve"> Attend technical discovery sessions with manufacturers, formulating targeted questions regarding data preprocessing, validation splits, model drift mitigation, and harness-level deterministic policy enforcement.</w:t>
       </w:r>
     </w:p>
     <w:p>
@@ -545,7 +575,7 @@
           <w:color w:val="28323C"/>
           <w:sz w:val="19"/>
         </w:rPr>
-        <w:t xml:space="preserve"> Collaborate on developing or validating internal AI testing tools used to evaluate client model submissions.</w:t>
+        <w:t xml:space="preserve"> Collaborate on developing or validating internal AI testing tools, potentially introducing trajectory observability instrumentation (OpenTelemetry, Langfuse) for evaluating agent-based submissions.</w:t>
       </w:r>
     </w:p>
     <w:p>
@@ -619,7 +649,7 @@
           <w:color w:val="28323C"/>
           <w:sz w:val="19"/>
         </w:rPr>
-        <w:t xml:space="preserve"> Author technical guidance or training modules for BSI colleagues on evaluating modern generative AI, LLM fine-tuning, and multimodal model risks (leveraging Stanford TECH 77 and Harvard agentic insights).</w:t>
+        <w:t xml:space="preserve"> Author technical guidance or training modules for BSI colleagues on evaluating modern generative AI, LLM fine-tuning, multimodal model risks, and agentic system harness architectures.</w:t>
       </w:r>
     </w:p>
     <w:p>
@@ -649,7 +679,7 @@
           <w:color w:val="28323C"/>
           <w:sz w:val="19"/>
         </w:rPr>
-        <w:t xml:space="preserve"> Identify optimization opportunities in BSI’s technical review workflows, reducing review cycle times while maintaining uncompromised auditing rigor.</w:t>
+        <w:t xml:space="preserve"> Identify optimization opportunities in BSI's technical review workflows, reducing review cycle times while maintaining uncompromised auditing rigor.</w:t>
       </w:r>
     </w:p>
     <w:p>
@@ -797,7 +827,7 @@
           <w:color w:val="28323C"/>
           <w:sz w:val="19"/>
         </w:rPr>
-        <w:t xml:space="preserve"> I scrutinize the training, validation, and test dataset splits to verify strict temporal or patient/subject isolation, ensuring zero feature contamination. I inspect the data provenance, labeling protocols, and demographic stratification. I require the manufacturer to provide confusion matrices, subgroup performance metrics, calibration curves, and error surface analysis under noise and adversarial perturbations.</w:t>
+        <w:t xml:space="preserve"> I scrutinize the training, validation, and test dataset splits to verify strict temporal or patient/subject isolation, ensuring zero feature contamination. I inspect the data provenance, labeling protocols, and demographic stratification. I require the manufacturer to provide confusion matrices, subgroup performance metrics, calibration curves, and error surface analysis under noise and adversarial perturbations. I also check for benchmark contamination — whether the test set has been inadvertently seen during training — using techniques like SWE-smith programmatic task mutation to generate held-out evaluation variants.</w:t>
       </w:r>
     </w:p>
     <w:p>
@@ -827,7 +857,7 @@
           <w:color w:val="28323C"/>
           <w:sz w:val="19"/>
         </w:rPr>
-        <w:t xml:space="preserve"> Successfully detects hidden overfitting and dataset bias before certification, protecting end users and upholding the integrity of the CE mark.</w:t>
+        <w:t xml:space="preserve"> Successfully detects hidden overfitting, dataset bias, and benchmark contamination before certification, protecting end users and upholding the integrity of the CE mark.</w:t>
       </w:r>
     </w:p>
     <w:p>
@@ -1065,7 +1095,7 @@
           <w:color w:val="28323C"/>
           <w:sz w:val="19"/>
         </w:rPr>
-        <w:t xml:space="preserve"> In my Stanford TECH 77 project, I built and evaluated an auditable document intelligence pipeline benchmarking Vision Language Models (VLMs) and Document Transformers against OCR baselines.</w:t>
+        <w:t xml:space="preserve"> In my Stanford TECH 77 project, I built and evaluated an auditable document intelligence pipeline benchmarking Vision Language Models and Document Transformers against OCR baselines.</w:t>
       </w:r>
     </w:p>
     <w:p>
@@ -1125,7 +1155,7 @@
           <w:color w:val="28323C"/>
           <w:sz w:val="19"/>
         </w:rPr>
-        <w:t xml:space="preserve"> I evaluated failure modes where VLMs hallucinatory tokens on complex table structures. To mitigate this, I implemented LangGraph StateGraph deterministic routing, strict Pydantic JSON schema enforcement, and confidence-score anomaly gating that triggered human-in-the-loop review. I also introduced adversarial input filters to catch indirect prompt injection.</w:t>
+        <w:t xml:space="preserve"> I evaluated failure modes where VLMs hallucinated tokens on complex table structures. To mitigate this, I implemented LangGraph StateGraph deterministic routing, strict Pydantic JSON schema enforcement, and confidence-score anomaly gating that triggered human-in-the-loop review. I also introduced adversarial input filters to catch indirect prompt injection. These techniques directly inform how I would evaluate a manufacturer's submission for hallucination robustness.</w:t>
       </w:r>
     </w:p>
     <w:p>
@@ -1155,7 +1185,7 @@
           <w:color w:val="28323C"/>
           <w:sz w:val="19"/>
         </w:rPr>
-        <w:t xml:space="preserve"> Established a concrete, auditable framework for certifying that generative AI systems have adequate deterministic boundaries, output verification gates, and human oversight mechanisms as mandated by Article 14 of the EU AI Act.</w:t>
+        <w:t xml:space="preserve"> Establishes a rigorous, replicable assessment methodology that BSI can standardize for evaluating generative AI submissions under EU AI Act Article 15 (Accuracy, Robustness, and Cybersecurity).</w:t>
       </w:r>
     </w:p>
     <w:p>
@@ -1169,7 +1199,7 @@
           <w:color w:val="28466E"/>
           <w:sz w:val="21"/>
         </w:rPr>
-        <w:t>Scenario 4: Communicating Non-Conformities to Client Leadership Without Creating Impasse</w:t>
+        <w:t>Scenario 4: Evaluating Agentic AI Systems — Harness Architecture &amp; Trajectory Auditability (Packt/Koenigstein)</w:t>
       </w:r>
     </w:p>
     <w:p>
@@ -1199,7 +1229,7 @@
           <w:color w:val="28323C"/>
           <w:sz w:val="19"/>
         </w:rPr>
-        <w:t xml:space="preserve"> During an audit, an AI developer pushes back strongly against a finding of non-conformity regarding inadequate data governance or lack of post-market drift monitoring.</w:t>
+        <w:t xml:space="preserve"> A manufacturer submits an autonomous AI agent system for conformity assessment — an increasingly common scenario as agentic AI enters regulated verticals including medical devices, financial systems, and critical infrastructure.</w:t>
       </w:r>
     </w:p>
     <w:p>
@@ -1229,7 +1259,7 @@
           <w:color w:val="28323C"/>
           <w:sz w:val="19"/>
         </w:rPr>
-        <w:t xml:space="preserve"> As a Senior Escalation Lead at DOI/IBC for 14 years, I regularly navigated high-stakes technical disagreements with senior government stakeholders and vendor software engineering leads.</w:t>
+        <w:t xml:space="preserve"> In the Packt Agentic AI for Finance intensive under Nicole Koenigstein, I architected a governed multi-agent Trading Copilot with hierarchical supervisor topology, bounded execution budgets, and full trajectory observability.</w:t>
       </w:r>
     </w:p>
     <w:p>
@@ -1259,7 +1289,7 @@
           <w:color w:val="28323C"/>
           <w:sz w:val="19"/>
         </w:rPr>
-        <w:t xml:space="preserve"> Maintain uncompromised compliance standards while preserving a constructive, professional partnership with the client.</w:t>
+        <w:t xml:space="preserve"> Design a conformity assessment protocol for evaluating autonomous agent systems that goes beyond static model evaluation to assess the entire runtime harness, loop governance, and execution security.</w:t>
       </w:r>
     </w:p>
     <w:p>
@@ -1289,7 +1319,140 @@
           <w:color w:val="28323C"/>
           <w:sz w:val="19"/>
         </w:rPr>
-        <w:t xml:space="preserve"> I anchor the discussion strictly in objective, published standard clauses (e.g., ISO/IEC 42001 Section 8 or EU AI Act Article 10). Rather than criticizing the design, I present empirical evidence of the risk—such as lack of performance monitoring under out-of-distribution inputs. I clearly explain the regulatory rationale and outline acceptable remediation pathways (e.g., establishing automated drift alerts and retraining triggers).</w:t>
+        <w:t xml:space="preserve"> I assess the agent against the 4-layer harness architecture:</w:t>
+      </w:r>
+    </w:p>
+    <w:p>
+      <w:pPr>
+        <w:spacing w:before="0" w:after="80"/>
+      </w:pPr>
+      <w:r>
+        <w:rPr>
+          <w:rFonts w:ascii="Calibri" w:hAnsi="Calibri"/>
+          <w:color w:val="28323C"/>
+          <w:sz w:val="19"/>
+        </w:rPr>
+        <w:t xml:space="preserve">  - </w:t>
+      </w:r>
+      <w:r>
+        <w:rPr>
+          <w:rFonts w:ascii="Calibri" w:hAnsi="Calibri"/>
+          <w:b/>
+          <w:color w:val="28323C"/>
+          <w:sz w:val="19"/>
+        </w:rPr>
+        <w:t>Layer 1 (Identity &amp; Behavior):</w:t>
+      </w:r>
+      <w:r>
+        <w:rPr>
+          <w:rFonts w:ascii="Calibri" w:hAnsi="Calibri"/>
+          <w:color w:val="28323C"/>
+          <w:sz w:val="19"/>
+        </w:rPr>
+        <w:t xml:space="preserve"> Are agent roles, permissions, and behavioral boundaries clearly defined and documented?</w:t>
+      </w:r>
+    </w:p>
+    <w:p>
+      <w:pPr>
+        <w:spacing w:before="0" w:after="80"/>
+      </w:pPr>
+      <w:r>
+        <w:rPr>
+          <w:rFonts w:ascii="Calibri" w:hAnsi="Calibri"/>
+          <w:color w:val="28323C"/>
+          <w:sz w:val="19"/>
+        </w:rPr>
+        <w:t xml:space="preserve">  - </w:t>
+      </w:r>
+      <w:r>
+        <w:rPr>
+          <w:rFonts w:ascii="Calibri" w:hAnsi="Calibri"/>
+          <w:b/>
+          <w:color w:val="28323C"/>
+          <w:sz w:val="19"/>
+        </w:rPr>
+        <w:t>Layer 2 (Runtime):</w:t>
+      </w:r>
+      <w:r>
+        <w:rPr>
+          <w:rFonts w:ascii="Calibri" w:hAnsi="Calibri"/>
+          <w:color w:val="28323C"/>
+          <w:sz w:val="19"/>
+        </w:rPr>
+        <w:t xml:space="preserve"> Is the execution sandboxed (Docker, E2B, WASM)? Are tool contracts schema-governed with strict typed validation?</w:t>
+      </w:r>
+    </w:p>
+    <w:p>
+      <w:pPr>
+        <w:spacing w:before="0" w:after="80"/>
+      </w:pPr>
+      <w:r>
+        <w:rPr>
+          <w:rFonts w:ascii="Calibri" w:hAnsi="Calibri"/>
+          <w:color w:val="28323C"/>
+          <w:sz w:val="19"/>
+        </w:rPr>
+        <w:t xml:space="preserve">  - </w:t>
+      </w:r>
+      <w:r>
+        <w:rPr>
+          <w:rFonts w:ascii="Calibri" w:hAnsi="Calibri"/>
+          <w:b/>
+          <w:color w:val="28323C"/>
+          <w:sz w:val="19"/>
+        </w:rPr>
+        <w:t>Layer 3 (Feedback Loop):</w:t>
+      </w:r>
+      <w:r>
+        <w:rPr>
+          <w:rFonts w:ascii="Calibri" w:hAnsi="Calibri"/>
+          <w:color w:val="28323C"/>
+          <w:sz w:val="19"/>
+        </w:rPr>
+        <w:t xml:space="preserve"> Are there mandatory termination conditions (success, budget, no-progress oscillation guard, hard stop)? Does the system distinguish between reflection (style improvement) and verification (ground-truth validation)?</w:t>
+      </w:r>
+    </w:p>
+    <w:p>
+      <w:pPr>
+        <w:spacing w:before="0" w:after="80"/>
+      </w:pPr>
+      <w:r>
+        <w:rPr>
+          <w:rFonts w:ascii="Calibri" w:hAnsi="Calibri"/>
+          <w:color w:val="28323C"/>
+          <w:sz w:val="19"/>
+        </w:rPr>
+        <w:t xml:space="preserve">  - </w:t>
+      </w:r>
+      <w:r>
+        <w:rPr>
+          <w:rFonts w:ascii="Calibri" w:hAnsi="Calibri"/>
+          <w:b/>
+          <w:color w:val="28323C"/>
+          <w:sz w:val="19"/>
+        </w:rPr>
+        <w:t>Layer 4 (Governance &amp; Security):</w:t>
+      </w:r>
+      <w:r>
+        <w:rPr>
+          <w:rFonts w:ascii="Calibri" w:hAnsi="Calibri"/>
+          <w:color w:val="28323C"/>
+          <w:sz w:val="19"/>
+        </w:rPr>
+        <w:t xml:space="preserve"> Does the system mitigate OWASP Top 15 Agent Vulnerabilities? Is there a 3-tier structured output validation pipeline? Are trajectory logs immutable and auditable via OpenTelemetry?</w:t>
+      </w:r>
+    </w:p>
+    <w:p>
+      <w:pPr>
+        <w:spacing w:before="0" w:after="80"/>
+      </w:pPr>
+      <w:r>
+        <w:rPr>
+          <w:rFonts w:ascii="Calibri" w:hAnsi="Calibri"/>
+          <w:color w:val="28323C"/>
+          <w:sz w:val="19"/>
+        </w:rPr>
+        <w:t xml:space="preserve">  I evaluate the 6-dimension scorecard: Correctness, Grounding, Latency p95, Cost, Safety, and Auditability, and verify that Grounding, Safety, and Auditability are treated as zero-tolerance blocking gates for release.</w:t>
       </w:r>
     </w:p>
     <w:p>
@@ -1319,7 +1482,7 @@
           <w:color w:val="28323C"/>
           <w:sz w:val="19"/>
         </w:rPr>
-        <w:t xml:space="preserve"> Defused client defensiveness, achieved full agreement on corrective actions, and ensured the system met all regulatory criteria prior to formal sign-off.</w:t>
+        <w:t xml:space="preserve"> Provides BSI with an expert who can pioneer assessment frameworks for the rapidly growing category of agentic AI systems — a competitive differentiator for BSI's Notified Body services.</w:t>
       </w:r>
     </w:p>
     <w:p>
@@ -1333,7 +1496,7 @@
           <w:color w:val="28466E"/>
           <w:sz w:val="21"/>
         </w:rPr>
-        <w:t>Scenario 5: Reviewing Software Development Lifecycles (SDLC) and Change Management</w:t>
+        <w:t>Scenario 5: Assessing AI System Security &amp; OWASP Agent Vulnerabilities (Packt/Koenigstein)</w:t>
       </w:r>
     </w:p>
     <w:p>
@@ -1363,7 +1526,7 @@
           <w:color w:val="28323C"/>
           <w:sz w:val="19"/>
         </w:rPr>
-        <w:t xml:space="preserve"> AI systems are dynamic; continuous model updates and retrained weights can invalidate previous conformity assessments.</w:t>
+        <w:t xml:space="preserve"> A manufacturer submits an AI-enabled IoT medical device that uses an LLM agent to interpret sensor data, generate clinical recommendations, and communicate with hospital EHR systems. BSI must evaluate the system's security posture.</w:t>
       </w:r>
     </w:p>
     <w:p>
@@ -1393,7 +1556,7 @@
           <w:color w:val="28323C"/>
           <w:sz w:val="19"/>
         </w:rPr>
-        <w:t xml:space="preserve"> Manufacturers often push continuous integration updates to AI models without evaluating whether the change constitutes a "substantial modification" under regulatory frameworks.</w:t>
+        <w:t xml:space="preserve"> In the Packt intensive, I studied the OWASP Top 15 Agent Vulnerabilities taxonomy and implemented defense strategies for Confused Deputy attacks, Memory Poisoning, Tool Misuse, and Unexpected Remote Code Execution.</w:t>
       </w:r>
     </w:p>
     <w:p>
@@ -1423,7 +1586,7 @@
           <w:color w:val="28323C"/>
           <w:sz w:val="19"/>
         </w:rPr>
-        <w:t xml:space="preserve"> Evaluate the manufacturer's change management procedure and SDLC controls to ensure post-certification updates remain compliant.</w:t>
+        <w:t xml:space="preserve"> Conduct a comprehensive security threat assessment of the agent-based medical device against both the EU AI Act cybersecurity requirements (Article 15) and the OWASP agent vulnerability framework.</w:t>
       </w:r>
     </w:p>
     <w:p>
@@ -1453,7 +1616,140 @@
           <w:color w:val="28323C"/>
           <w:sz w:val="19"/>
         </w:rPr>
-        <w:t xml:space="preserve"> I audit their version control, model registry, and CI/CD pipelines. I verify that automated regression test suites run on every commit and that significant updates—such as retraining on new demographic distributions or changing model architectures—trigger formal impact assessments and re-notification protocols.</w:t>
+        <w:t xml:space="preserve"> I map each OWASP vulnerability to the manufacturer's architecture:</w:t>
+      </w:r>
+    </w:p>
+    <w:p>
+      <w:pPr>
+        <w:spacing w:before="0" w:after="80"/>
+      </w:pPr>
+      <w:r>
+        <w:rPr>
+          <w:rFonts w:ascii="Calibri" w:hAnsi="Calibri"/>
+          <w:color w:val="28323C"/>
+          <w:sz w:val="19"/>
+        </w:rPr>
+        <w:t xml:space="preserve">  - </w:t>
+      </w:r>
+      <w:r>
+        <w:rPr>
+          <w:rFonts w:ascii="Calibri" w:hAnsi="Calibri"/>
+          <w:b/>
+          <w:color w:val="28323C"/>
+          <w:sz w:val="19"/>
+        </w:rPr>
+        <w:t>Confused Deputy (T3):</w:t>
+      </w:r>
+      <w:r>
+        <w:rPr>
+          <w:rFonts w:ascii="Calibri" w:hAnsi="Calibri"/>
+          <w:color w:val="28323C"/>
+          <w:sz w:val="19"/>
+        </w:rPr>
+        <w:t xml:space="preserve"> Does the agent use the Principle of Least Privilege? Can external inputs manipulate the agent into executing unauthorized actions?</w:t>
+      </w:r>
+    </w:p>
+    <w:p>
+      <w:pPr>
+        <w:spacing w:before="0" w:after="80"/>
+      </w:pPr>
+      <w:r>
+        <w:rPr>
+          <w:rFonts w:ascii="Calibri" w:hAnsi="Calibri"/>
+          <w:color w:val="28323C"/>
+          <w:sz w:val="19"/>
+        </w:rPr>
+        <w:t xml:space="preserve">  - </w:t>
+      </w:r>
+      <w:r>
+        <w:rPr>
+          <w:rFonts w:ascii="Calibri" w:hAnsi="Calibri"/>
+          <w:b/>
+          <w:color w:val="28323C"/>
+          <w:sz w:val="19"/>
+        </w:rPr>
+        <w:t>Memory Poisoning (T1):</w:t>
+      </w:r>
+      <w:r>
+        <w:rPr>
+          <w:rFonts w:ascii="Calibri" w:hAnsi="Calibri"/>
+          <w:color w:val="28323C"/>
+          <w:sz w:val="19"/>
+        </w:rPr>
+        <w:t xml:space="preserve"> Are long-term memory stores and vector databases protected against adversarial injection? Is there provenance tracking on ingested embeddings?</w:t>
+      </w:r>
+    </w:p>
+    <w:p>
+      <w:pPr>
+        <w:spacing w:before="0" w:after="80"/>
+      </w:pPr>
+      <w:r>
+        <w:rPr>
+          <w:rFonts w:ascii="Calibri" w:hAnsi="Calibri"/>
+          <w:color w:val="28323C"/>
+          <w:sz w:val="19"/>
+        </w:rPr>
+        <w:t xml:space="preserve">  - </w:t>
+      </w:r>
+      <w:r>
+        <w:rPr>
+          <w:rFonts w:ascii="Calibri" w:hAnsi="Calibri"/>
+          <w:b/>
+          <w:color w:val="28323C"/>
+          <w:sz w:val="19"/>
+        </w:rPr>
+        <w:t>Unexpected RCE (T11):</w:t>
+      </w:r>
+      <w:r>
+        <w:rPr>
+          <w:rFonts w:ascii="Calibri" w:hAnsi="Calibri"/>
+          <w:color w:val="28323C"/>
+          <w:sz w:val="19"/>
+        </w:rPr>
+        <w:t xml:space="preserve"> Is code execution sandboxed with network isolation, dropped capabilities, and read-only root filesystems?</w:t>
+      </w:r>
+    </w:p>
+    <w:p>
+      <w:pPr>
+        <w:spacing w:before="0" w:after="80"/>
+      </w:pPr>
+      <w:r>
+        <w:rPr>
+          <w:rFonts w:ascii="Calibri" w:hAnsi="Calibri"/>
+          <w:color w:val="28323C"/>
+          <w:sz w:val="19"/>
+        </w:rPr>
+        <w:t xml:space="preserve">  - </w:t>
+      </w:r>
+      <w:r>
+        <w:rPr>
+          <w:rFonts w:ascii="Calibri" w:hAnsi="Calibri"/>
+          <w:b/>
+          <w:color w:val="28323C"/>
+          <w:sz w:val="19"/>
+        </w:rPr>
+        <w:t>Cascading Hallucination (T5):</w:t>
+      </w:r>
+      <w:r>
+        <w:rPr>
+          <w:rFonts w:ascii="Calibri" w:hAnsi="Calibri"/>
+          <w:color w:val="28323C"/>
+          <w:sz w:val="19"/>
+        </w:rPr>
+        <w:t xml:space="preserve"> Can a hallucinated output from one agent propagate unchecked through downstream agents?</w:t>
+      </w:r>
+    </w:p>
+    <w:p>
+      <w:pPr>
+        <w:spacing w:before="0" w:after="80"/>
+      </w:pPr>
+      <w:r>
+        <w:rPr>
+          <w:rFonts w:ascii="Calibri" w:hAnsi="Calibri"/>
+          <w:color w:val="28323C"/>
+          <w:sz w:val="19"/>
+        </w:rPr>
+        <w:t xml:space="preserve">  I verify whether the manufacturer implements a Zero-Trust architecture isolating the user interface from the agent runtime, and whether path traversal protections prevent directory escape.</w:t>
       </w:r>
     </w:p>
     <w:p>
@@ -1483,7 +1779,274 @@
           <w:color w:val="28323C"/>
           <w:sz w:val="19"/>
         </w:rPr>
-        <w:t xml:space="preserve"> Guarantees that the manufacturer has robust lifecycle controls preventing unmonitored model drift or unauthorized functional alterations in production.</w:t>
+        <w:t xml:space="preserve"> Delivers a rigorous, threat-model-driven security assessment that exceeds standard regulatory checklists, establishing BSI as a leader in evaluating the unique security posture of agentic AI systems.</w:t>
+      </w:r>
+    </w:p>
+    <w:p>
+      <w:pPr>
+        <w:spacing w:before="120" w:after="40"/>
+      </w:pPr>
+      <w:r>
+        <w:rPr>
+          <w:rFonts w:ascii="Calibri" w:hAnsi="Calibri"/>
+          <w:b/>
+          <w:color w:val="28466E"/>
+          <w:sz w:val="21"/>
+        </w:rPr>
+        <w:t>Scenario 6: Evaluating Structured Output Safety — 3-Tier Validation Pipeline (Packt/Koenigstein)</w:t>
+      </w:r>
+    </w:p>
+    <w:p>
+      <w:pPr>
+        <w:pStyle w:val="ListBullet"/>
+        <w:spacing w:before="0" w:after="40"/>
+      </w:pPr>
+      <w:r>
+        <w:rPr>
+          <w:rFonts w:ascii="Calibri" w:hAnsi="Calibri"/>
+          <w:color w:val="28323C"/>
+          <w:sz w:val="19"/>
+        </w:rPr>
+      </w:r>
+      <w:r>
+        <w:rPr>
+          <w:rFonts w:ascii="Calibri" w:hAnsi="Calibri"/>
+          <w:b/>
+          <w:color w:val="28323C"/>
+          <w:sz w:val="19"/>
+        </w:rPr>
+        <w:t>Context:</w:t>
+      </w:r>
+      <w:r>
+        <w:rPr>
+          <w:rFonts w:ascii="Calibri" w:hAnsi="Calibri"/>
+          <w:color w:val="28323C"/>
+          <w:sz w:val="19"/>
+        </w:rPr>
+        <w:t xml:space="preserve"> A manufacturer submits a clinical decision support LLM that generates structured treatment recommendations in JSON format for integration with hospital formulary systems.</w:t>
+      </w:r>
+    </w:p>
+    <w:p>
+      <w:pPr>
+        <w:pStyle w:val="ListBullet"/>
+        <w:spacing w:before="0" w:after="40"/>
+      </w:pPr>
+      <w:r>
+        <w:rPr>
+          <w:rFonts w:ascii="Calibri" w:hAnsi="Calibri"/>
+          <w:color w:val="28323C"/>
+          <w:sz w:val="19"/>
+        </w:rPr>
+      </w:r>
+      <w:r>
+        <w:rPr>
+          <w:rFonts w:ascii="Calibri" w:hAnsi="Calibri"/>
+          <w:b/>
+          <w:color w:val="28323C"/>
+          <w:sz w:val="19"/>
+        </w:rPr>
+        <w:t>Situation:</w:t>
+      </w:r>
+      <w:r>
+        <w:rPr>
+          <w:rFonts w:ascii="Calibri" w:hAnsi="Calibri"/>
+          <w:color w:val="28323C"/>
+          <w:sz w:val="19"/>
+        </w:rPr>
+        <w:t xml:space="preserve"> In my Packt training, I learned and implemented the 3-tier fallback validation pipeline for ensuring structured output integrity in production AI systems.</w:t>
+      </w:r>
+    </w:p>
+    <w:p>
+      <w:pPr>
+        <w:pStyle w:val="ListBullet"/>
+        <w:spacing w:before="0" w:after="40"/>
+      </w:pPr>
+      <w:r>
+        <w:rPr>
+          <w:rFonts w:ascii="Calibri" w:hAnsi="Calibri"/>
+          <w:color w:val="28323C"/>
+          <w:sz w:val="19"/>
+        </w:rPr>
+      </w:r>
+      <w:r>
+        <w:rPr>
+          <w:rFonts w:ascii="Calibri" w:hAnsi="Calibri"/>
+          <w:b/>
+          <w:color w:val="28323C"/>
+          <w:sz w:val="19"/>
+        </w:rPr>
+        <w:t>Task:</w:t>
+      </w:r>
+      <w:r>
+        <w:rPr>
+          <w:rFonts w:ascii="Calibri" w:hAnsi="Calibri"/>
+          <w:color w:val="28323C"/>
+          <w:sz w:val="19"/>
+        </w:rPr>
+        <w:t xml:space="preserve"> Assess whether the manufacturer's structured output generation is robust enough that malformed, hallucinated, or schema-violating outputs cannot reach the downstream clinical system.</w:t>
+      </w:r>
+    </w:p>
+    <w:p>
+      <w:pPr>
+        <w:pStyle w:val="ListBullet"/>
+        <w:spacing w:before="0" w:after="40"/>
+      </w:pPr>
+      <w:r>
+        <w:rPr>
+          <w:rFonts w:ascii="Calibri" w:hAnsi="Calibri"/>
+          <w:color w:val="28323C"/>
+          <w:sz w:val="19"/>
+        </w:rPr>
+      </w:r>
+      <w:r>
+        <w:rPr>
+          <w:rFonts w:ascii="Calibri" w:hAnsi="Calibri"/>
+          <w:b/>
+          <w:color w:val="28323C"/>
+          <w:sz w:val="19"/>
+        </w:rPr>
+        <w:t>Action:</w:t>
+      </w:r>
+      <w:r>
+        <w:rPr>
+          <w:rFonts w:ascii="Calibri" w:hAnsi="Calibri"/>
+          <w:color w:val="28323C"/>
+          <w:sz w:val="19"/>
+        </w:rPr>
+        <w:t xml:space="preserve"> I evaluate the system against the 3-tier hierarchy:</w:t>
+      </w:r>
+    </w:p>
+    <w:p>
+      <w:pPr>
+        <w:spacing w:before="0" w:after="80"/>
+      </w:pPr>
+      <w:r>
+        <w:rPr>
+          <w:rFonts w:ascii="Calibri" w:hAnsi="Calibri"/>
+          <w:color w:val="28323C"/>
+          <w:sz w:val="19"/>
+        </w:rPr>
+        <w:t xml:space="preserve">  - </w:t>
+      </w:r>
+      <w:r>
+        <w:rPr>
+          <w:rFonts w:ascii="Calibri" w:hAnsi="Calibri"/>
+          <w:b/>
+          <w:color w:val="28323C"/>
+          <w:sz w:val="19"/>
+        </w:rPr>
+        <w:t>Tier 1 (Strict JSON Schema Mode):</w:t>
+      </w:r>
+      <w:r>
+        <w:rPr>
+          <w:rFonts w:ascii="Calibri" w:hAnsi="Calibri"/>
+          <w:color w:val="28323C"/>
+          <w:sz w:val="19"/>
+        </w:rPr>
+        <w:t xml:space="preserve"> Does the system use provider-level constrained decoding to force model logits to conform to a defined JSON grammar?</w:t>
+      </w:r>
+    </w:p>
+    <w:p>
+      <w:pPr>
+        <w:spacing w:before="0" w:after="80"/>
+      </w:pPr>
+      <w:r>
+        <w:rPr>
+          <w:rFonts w:ascii="Calibri" w:hAnsi="Calibri"/>
+          <w:color w:val="28323C"/>
+          <w:sz w:val="19"/>
+        </w:rPr>
+        <w:t xml:space="preserve">  - </w:t>
+      </w:r>
+      <w:r>
+        <w:rPr>
+          <w:rFonts w:ascii="Calibri" w:hAnsi="Calibri"/>
+          <w:b/>
+          <w:color w:val="28323C"/>
+          <w:sz w:val="19"/>
+        </w:rPr>
+        <w:t>Tier 2 (Instructor + Pydantic Retries):</w:t>
+      </w:r>
+      <w:r>
+        <w:rPr>
+          <w:rFonts w:ascii="Calibri" w:hAnsi="Calibri"/>
+          <w:color w:val="28323C"/>
+          <w:sz w:val="19"/>
+        </w:rPr>
+        <w:t xml:space="preserve"> If Tier 1 fails, does a self-healing validation loop with typed Pydantic validators and retry logic catch and correct malformed outputs?</w:t>
+      </w:r>
+    </w:p>
+    <w:p>
+      <w:pPr>
+        <w:spacing w:before="0" w:after="80"/>
+      </w:pPr>
+      <w:r>
+        <w:rPr>
+          <w:rFonts w:ascii="Calibri" w:hAnsi="Calibri"/>
+          <w:color w:val="28323C"/>
+          <w:sz w:val="19"/>
+        </w:rPr>
+        <w:t xml:space="preserve">  - </w:t>
+      </w:r>
+      <w:r>
+        <w:rPr>
+          <w:rFonts w:ascii="Calibri" w:hAnsi="Calibri"/>
+          <w:b/>
+          <w:color w:val="28323C"/>
+          <w:sz w:val="19"/>
+        </w:rPr>
+        <w:t>Tier 3 (Deterministic Canonicalization):</w:t>
+      </w:r>
+      <w:r>
+        <w:rPr>
+          <w:rFonts w:ascii="Calibri" w:hAnsi="Calibri"/>
+          <w:color w:val="28323C"/>
+          <w:sz w:val="19"/>
+        </w:rPr>
+        <w:t xml:space="preserve"> If Tier 2 fails, does a final regex/AST-based heuristic repair attempt to salvage the output before triggering a hard failure and human escalation?</w:t>
+      </w:r>
+    </w:p>
+    <w:p>
+      <w:pPr>
+        <w:spacing w:before="0" w:after="80"/>
+      </w:pPr>
+      <w:r>
+        <w:rPr>
+          <w:rFonts w:ascii="Calibri" w:hAnsi="Calibri"/>
+          <w:color w:val="28323C"/>
+          <w:sz w:val="19"/>
+        </w:rPr>
+        <w:t xml:space="preserve">  I verify that a complete failure of all three tiers triggers the 3-rung escalation ladder (retry in place, re-plan, state-preserving human gate) rather than passing corrupt data downstream.</w:t>
+      </w:r>
+    </w:p>
+    <w:p>
+      <w:pPr>
+        <w:pStyle w:val="ListBullet"/>
+        <w:spacing w:before="0" w:after="40"/>
+      </w:pPr>
+      <w:r>
+        <w:rPr>
+          <w:rFonts w:ascii="Calibri" w:hAnsi="Calibri"/>
+          <w:color w:val="28323C"/>
+          <w:sz w:val="19"/>
+        </w:rPr>
+      </w:r>
+      <w:r>
+        <w:rPr>
+          <w:rFonts w:ascii="Calibri" w:hAnsi="Calibri"/>
+          <w:b/>
+          <w:color w:val="28323C"/>
+          <w:sz w:val="19"/>
+        </w:rPr>
+        <w:t>Result:</w:t>
+      </w:r>
+      <w:r>
+        <w:rPr>
+          <w:rFonts w:ascii="Calibri" w:hAnsi="Calibri"/>
+          <w:color w:val="28323C"/>
+          <w:sz w:val="19"/>
+        </w:rPr>
+        <w:t xml:space="preserve"> Provides BSI with a structured, replicable assessment methodology for evaluating the output safety of generative AI systems — a critical gap in current conformity assessment procedures.</w:t>
       </w:r>
     </w:p>
     <w:p>
@@ -1497,7 +2060,7 @@
           <w:color w:val="17365D"/>
           <w:sz w:val="23"/>
         </w:rPr>
-        <w:t>4. Strategic Reverse Questions for the BSI Interview Panel</w:t>
+        <w:t>4. Technical Deep-Dive Questions &amp; Prepared Responses</w:t>
       </w:r>
     </w:p>
     <w:p>
@@ -1511,7 +2074,7 @@
           <w:color w:val="28466E"/>
           <w:sz w:val="21"/>
         </w:rPr>
-        <w:t>Questions for the Head of AI Conformity Assessment / Notified Body Leadership:</w:t>
+        <w:t>Q: "What is harness engineering and why does it matter for conformity assessment?"</w:t>
       </w:r>
     </w:p>
     <w:p>
@@ -1524,16 +2087,15 @@
           <w:color w:val="28323C"/>
           <w:sz w:val="19"/>
         </w:rPr>
-        <w:t xml:space="preserve">1. </w:t>
       </w:r>
       <w:r>
         <w:rPr>
           <w:rFonts w:ascii="Calibri" w:hAnsi="Calibri"/>
-          <w:i/>
+          <w:b/>
           <w:color w:val="28323C"/>
           <w:sz w:val="19"/>
         </w:rPr>
-        <w:t>"With the phased enforcement of the EU AI Act progressing rapidly, what are the primary industry sectors currently seeking Notified Body conformity assessments through BSI (e.g., medical devices vs. industrial automation vs. financial biometrics)?"</w:t>
+        <w:t>A:</w:t>
       </w:r>
       <w:r>
         <w:rPr>
@@ -1541,64 +2103,7 @@
           <w:color w:val="28323C"/>
           <w:sz w:val="19"/>
         </w:rPr>
-      </w:r>
-    </w:p>
-    <w:p>
-      <w:pPr>
-        <w:spacing w:before="0" w:after="80"/>
-      </w:pPr>
-      <w:r>
-        <w:rPr>
-          <w:rFonts w:ascii="Calibri" w:hAnsi="Calibri"/>
-          <w:color w:val="28323C"/>
-          <w:sz w:val="19"/>
-        </w:rPr>
-        <w:t xml:space="preserve">2. </w:t>
-      </w:r>
-      <w:r>
-        <w:rPr>
-          <w:rFonts w:ascii="Calibri" w:hAnsi="Calibri"/>
-          <w:i/>
-          <w:color w:val="28323C"/>
-          <w:sz w:val="19"/>
-        </w:rPr>
-        <w:t>"How does BSI coordinate between its Netherlands Notified Body (NB 2797) and the global team of AI Technical Specialists to ensure consistent interpretation of harmonized standards?"</w:t>
-      </w:r>
-      <w:r>
-        <w:rPr>
-          <w:rFonts w:ascii="Calibri" w:hAnsi="Calibri"/>
-          <w:color w:val="28323C"/>
-          <w:sz w:val="19"/>
-        </w:rPr>
-      </w:r>
-    </w:p>
-    <w:p>
-      <w:pPr>
-        <w:spacing w:before="0" w:after="80"/>
-      </w:pPr>
-      <w:r>
-        <w:rPr>
-          <w:rFonts w:ascii="Calibri" w:hAnsi="Calibri"/>
-          <w:color w:val="28323C"/>
-          <w:sz w:val="19"/>
-        </w:rPr>
-        <w:t xml:space="preserve">3. </w:t>
-      </w:r>
-      <w:r>
-        <w:rPr>
-          <w:rFonts w:ascii="Calibri" w:hAnsi="Calibri"/>
-          <w:i/>
-          <w:color w:val="28323C"/>
-          <w:sz w:val="19"/>
-        </w:rPr>
-        <w:t>"What internal testing tools or sandboxes is BSI currently developing to assist assessors in validating client model technical files?"</w:t>
-      </w:r>
-      <w:r>
-        <w:rPr>
-          <w:rFonts w:ascii="Calibri" w:hAnsi="Calibri"/>
-          <w:color w:val="28323C"/>
-          <w:sz w:val="19"/>
-        </w:rPr>
+        <w:t xml:space="preserve"> Harness engineering is the discipline of building the runtime architecture that surrounds a foundation model — the state machine, verification gates, execution sandboxes, and governance layers. The core thesis is: "Model proposes, Harness disposes." In a conformity assessment context, this means that evaluating only the model (accuracy, bias, drift) is insufficient. We must also evaluate the harness: Are permissions enforced in code rather than prompts? Are execution budgets bounded? Are termination conditions deterministic? Is the trajectory auditable? For BSI, this provides a structured methodology to assess the full AI system, not just the model component.</w:t>
       </w:r>
     </w:p>
     <w:p>
@@ -1612,7 +2117,7 @@
           <w:color w:val="28466E"/>
           <w:sz w:val="21"/>
         </w:rPr>
-        <w:t>Questions for Senior Technical Assessors / Team Leads:</w:t>
+        <w:t>Q: "How would you evaluate an AI system that uses multiple agents working together?"</w:t>
       </w:r>
     </w:p>
     <w:p>
@@ -1625,16 +2130,15 @@
           <w:color w:val="28323C"/>
           <w:sz w:val="19"/>
         </w:rPr>
-        <w:t xml:space="preserve">4. </w:t>
       </w:r>
       <w:r>
         <w:rPr>
           <w:rFonts w:ascii="Calibri" w:hAnsi="Calibri"/>
-          <w:i/>
+          <w:b/>
           <w:color w:val="28323C"/>
           <w:sz w:val="19"/>
         </w:rPr>
-        <w:t>"When evaluating proprietary or closed-source foundation models embedded in client applications, how does BSI verify compliance with transparency and data provenance requirements?"</w:t>
+        <w:t>A:</w:t>
       </w:r>
       <w:r>
         <w:rPr>
@@ -1642,64 +2146,7 @@
           <w:color w:val="28323C"/>
           <w:sz w:val="19"/>
         </w:rPr>
-      </w:r>
-    </w:p>
-    <w:p>
-      <w:pPr>
-        <w:spacing w:before="0" w:after="80"/>
-      </w:pPr>
-      <w:r>
-        <w:rPr>
-          <w:rFonts w:ascii="Calibri" w:hAnsi="Calibri"/>
-          <w:color w:val="28323C"/>
-          <w:sz w:val="19"/>
-        </w:rPr>
-        <w:t xml:space="preserve">5. </w:t>
-      </w:r>
-      <w:r>
-        <w:rPr>
-          <w:rFonts w:ascii="Calibri" w:hAnsi="Calibri"/>
-          <w:i/>
-          <w:color w:val="28323C"/>
-          <w:sz w:val="19"/>
-        </w:rPr>
-        <w:t>"How do you balance assessing purely statistical ML models (like Spark MLlib classification or regression) versus modern generative LLM / agentic architectures?"</w:t>
-      </w:r>
-      <w:r>
-        <w:rPr>
-          <w:rFonts w:ascii="Calibri" w:hAnsi="Calibri"/>
-          <w:color w:val="28323C"/>
-          <w:sz w:val="19"/>
-        </w:rPr>
-      </w:r>
-    </w:p>
-    <w:p>
-      <w:pPr>
-        <w:spacing w:before="0" w:after="80"/>
-      </w:pPr>
-      <w:r>
-        <w:rPr>
-          <w:rFonts w:ascii="Calibri" w:hAnsi="Calibri"/>
-          <w:color w:val="28323C"/>
-          <w:sz w:val="19"/>
-        </w:rPr>
-        <w:t xml:space="preserve">6. </w:t>
-      </w:r>
-      <w:r>
-        <w:rPr>
-          <w:rFonts w:ascii="Calibri" w:hAnsi="Calibri"/>
-          <w:i/>
-          <w:color w:val="28323C"/>
-          <w:sz w:val="19"/>
-        </w:rPr>
-        <w:t>"What does the typical lifecycle of a technical documentation review look like from initial dossier receipt to final assessment report?"</w:t>
-      </w:r>
-      <w:r>
-        <w:rPr>
-          <w:rFonts w:ascii="Calibri" w:hAnsi="Calibri"/>
-          <w:color w:val="28323C"/>
-          <w:sz w:val="19"/>
-        </w:rPr>
+        <w:t xml:space="preserve"> Multi-agent systems introduce coordination tax — the aggregate overhead in latency, token consumption, and reliability decay. If each agent has success probability $p$, a sequential pipeline of $n$ agents has aggregate reliability $p^n$. I would evaluate: (1) the coordination topology (hierarchical, peer-to-peer, blackboard, or swarm) and whether it's appropriate for the use case, (2) whether deterministic consolidation checkpoints exist between agent handoffs, (3) whether the system has termination conditions for infinite loops and oscillating debates, and (4) whether the trajectory of each agent's actions is independently auditable.</w:t>
       </w:r>
     </w:p>
     <w:p>
@@ -1713,7 +2160,7 @@
           <w:color w:val="28466E"/>
           <w:sz w:val="21"/>
         </w:rPr>
-        <w:t>Questions on Professional Development &amp; Team Collaboration:</w:t>
+        <w:t>Q: "How do you distinguish between a model failure and a harness failure?"</w:t>
       </w:r>
     </w:p>
     <w:p>
@@ -1726,16 +2173,15 @@
           <w:color w:val="28323C"/>
           <w:sz w:val="19"/>
         </w:rPr>
-        <w:t xml:space="preserve">7. </w:t>
       </w:r>
       <w:r>
         <w:rPr>
           <w:rFonts w:ascii="Calibri" w:hAnsi="Calibri"/>
-          <w:i/>
+          <w:b/>
           <w:color w:val="28323C"/>
           <w:sz w:val="19"/>
         </w:rPr>
-        <w:t>"Given BSI’s Royal Charter commitment to inspiring trust, how does the AI team contribute to shaping international standards committees (such as ISO/IEC JTC 1/SC 42 or CEN-CENELEC JTC 21)?"</w:t>
+        <w:t>A:</w:t>
       </w:r>
       <w:r>
         <w:rPr>
@@ -1743,6 +2189,21 @@
           <w:color w:val="28323C"/>
           <w:sz w:val="19"/>
         </w:rPr>
+        <w:t xml:space="preserve"> In production, over 85% of agent failures are harness failures, not model failures. A model failure is when the foundation model generates incorrect, biased, or hallucinated content despite receiving correct context and instructions. A harness failure is when the system surrounding the model fails — wrong context was provided, verification was skipped, the sandbox allowed unauthorized tool execution, or the escalation ladder did not trigger on a no-progress condition. For conformity assessment, this distinction is critical because a manufacturer who blames poor outcomes on the model may actually have a deficient harness that no model upgrade will fix.</w:t>
+      </w:r>
+    </w:p>
+    <w:p>
+      <w:pPr>
+        <w:spacing w:before="120" w:after="40"/>
+      </w:pPr>
+      <w:r>
+        <w:rPr>
+          <w:rFonts w:ascii="Calibri" w:hAnsi="Calibri"/>
+          <w:b/>
+          <w:color w:val="28466E"/>
+          <w:sz w:val="21"/>
+        </w:rPr>
+        <w:t>Q: "Explain how you would assess the observability of an AI agent system."</w:t>
       </w:r>
     </w:p>
     <w:p>
@@ -1755,16 +2216,15 @@
           <w:color w:val="28323C"/>
           <w:sz w:val="19"/>
         </w:rPr>
-        <w:t xml:space="preserve">8. </w:t>
       </w:r>
       <w:r>
         <w:rPr>
           <w:rFonts w:ascii="Calibri" w:hAnsi="Calibri"/>
-          <w:i/>
+          <w:b/>
           <w:color w:val="28323C"/>
           <w:sz w:val="19"/>
         </w:rPr>
-        <w:t>"What does success look like for an AI Technical Specialist in this team over their first 6 to 12 months?"</w:t>
+        <w:t>A:</w:t>
       </w:r>
       <w:r>
         <w:rPr>
@@ -1772,6 +2232,86 @@
           <w:color w:val="28323C"/>
           <w:sz w:val="19"/>
         </w:rPr>
+        <w:t xml:space="preserve"> I apply the 6-dimension evaluation scorecard: Correctness (factual accuracy of outputs), Grounding (ratio of assertions supported by retrieved citations), Latency p95 (95th percentile response time), Cost (token and compute expenditure), Safety (resistance to jailbreaks, prompt injections, and unauthorized actions), and Auditability (complete reproducible trace of all model calls, tool inputs, and state transitions). For conformity assessment, Grounding, Safety, and Auditability must be treated as zero-tolerance blocking gates, while Latency and Cost are budget-managed. I would verify the manufacturer instruments with open standards like OpenTelemetry GenAI semantic conventions and maintains immutable trajectory logs.</w:t>
+      </w:r>
+    </w:p>
+    <w:p>
+      <w:pPr>
+        <w:spacing w:before="200" w:after="80"/>
+      </w:pPr>
+      <w:r>
+        <w:rPr>
+          <w:rFonts w:ascii="Calibri" w:hAnsi="Calibri"/>
+          <w:b/>
+          <w:color w:val="17365D"/>
+          <w:sz w:val="23"/>
+        </w:rPr>
+        <w:t>5. Questions to Ask the BSI Interview Panel</w:t>
+      </w:r>
+    </w:p>
+    <w:p>
+      <w:pPr>
+        <w:spacing w:before="0" w:after="80"/>
+      </w:pPr>
+      <w:r>
+        <w:rPr>
+          <w:rFonts w:ascii="Calibri" w:hAnsi="Calibri"/>
+          <w:color w:val="28323C"/>
+          <w:sz w:val="19"/>
+        </w:rPr>
+        <w:t>1. "How is BSI positioning its AI conformity assessment capabilities relative to the growing category of agentic AI and multi-agent systems, versus traditional single-model evaluations?"</w:t>
+      </w:r>
+    </w:p>
+    <w:p>
+      <w:pPr>
+        <w:spacing w:before="0" w:after="80"/>
+      </w:pPr>
+      <w:r>
+        <w:rPr>
+          <w:rFonts w:ascii="Calibri" w:hAnsi="Calibri"/>
+          <w:color w:val="28323C"/>
+          <w:sz w:val="19"/>
+        </w:rPr>
+        <w:t>2. "What is the current mix of industry verticals (medical devices, biometrics, financial systems, robotics) in BSI's AI assessment pipeline, and which verticals are growing fastest?"</w:t>
+      </w:r>
+    </w:p>
+    <w:p>
+      <w:pPr>
+        <w:spacing w:before="0" w:after="80"/>
+      </w:pPr>
+      <w:r>
+        <w:rPr>
+          <w:rFonts w:ascii="Calibri" w:hAnsi="Calibri"/>
+          <w:color w:val="28323C"/>
+          <w:sz w:val="19"/>
+        </w:rPr>
+        <w:t>3. "How does BSI's internal assessment tooling currently handle trajectory-level evaluation of AI systems, versus outcome-only evaluation?"</w:t>
+      </w:r>
+    </w:p>
+    <w:p>
+      <w:pPr>
+        <w:spacing w:before="0" w:after="80"/>
+      </w:pPr>
+      <w:r>
+        <w:rPr>
+          <w:rFonts w:ascii="Calibri" w:hAnsi="Calibri"/>
+          <w:color w:val="28323C"/>
+          <w:sz w:val="19"/>
+        </w:rPr>
+        <w:t>4. "What harmonized standards is BSI currently referencing for cybersecurity assessment of AI systems, and is there interest in incorporating the OWASP agent vulnerability framework?"</w:t>
+      </w:r>
+    </w:p>
+    <w:p>
+      <w:pPr>
+        <w:spacing w:before="0" w:after="80"/>
+      </w:pPr>
+      <w:r>
+        <w:rPr>
+          <w:rFonts w:ascii="Calibri" w:hAnsi="Calibri"/>
+          <w:color w:val="28323C"/>
+          <w:sz w:val="19"/>
+        </w:rPr>
+        <w:t>5. "How does BSI approach the challenge of benchmark contamination when evaluating a manufacturer's claimed model performance metrics?"</w:t>
       </w:r>
     </w:p>
     <w:sectPr>

</xml_diff>